<commit_message>
Update HCLTech synopsis to exactly 7 pages, remove appendix, save under student credentials Yashika Gupta (2300320150073)
</commit_message>
<xml_diff>
--- a/Project_Synopsis_YashikaGupta_2300320150073.docx
+++ b/Project_Synopsis_YashikaGupta_2300320150073.docx
@@ -1163,110 +1163,7 @@
     </w:p>
     <w:p>
       <w:pPr>
-        <w:spacing w:before="240" w:after="80"/>
-      </w:pPr>
-      <w:r>
-        <w:rPr>
-          <w:rFonts w:ascii="Segoe UI" w:hAnsi="Segoe UI"/>
-          <w:b/>
-          <w:color w:val="003366"/>
-          <w:sz w:val="24"/>
-        </w:rPr>
-        <w:t>Appendix: Learner Oral Viva &amp; Presentation Guide</w:t>
-      </w:r>
-    </w:p>
-    <w:p>
-      <w:pPr>
-        <w:spacing w:after="80" w:line="288" w:lineRule="auto"/>
-      </w:pPr>
-      <w:r>
-        <w:rPr>
-          <w:rFonts w:ascii="Segoe UI" w:hAnsi="Segoe UI"/>
-          <w:b/>
-          <w:color w:val="003366"/>
-          <w:sz w:val="19"/>
-        </w:rPr>
-        <w:t>A. 2-Minute Oral Script (What to Speak in Front of HCL Evaluators):</w:t>
-        <w:br/>
-      </w:r>
-      <w:r>
-        <w:rPr>
-          <w:rFonts w:ascii="Segoe UI" w:hAnsi="Segoe UI"/>
-          <w:color w:val="1A202C"/>
-          <w:sz w:val="19"/>
-        </w:rPr>
-        <w:t>"Good morning respected evaluators. My name is Yashika Gupta (Roll No. 2300320150073) from ABES Engineering College, mentored by Dr. Anamika Goel. For my HCLTech Career Shaper capstone project, I developed an AI-Powered Chatbot for University Student Support.</w:t>
-        <w:br/>
-        <w:br/>
-        <w:t>During admissions and exams, college helpdesks receive hundreds of repetitive queries regarding fees, hostel allotments, and syllabus. Manual responses take 24 to 48 hours. I built this AI system to automate these queries 24/7 with instant responses.</w:t>
-        <w:br/>
-        <w:br/>
-        <w:t>The system is built in Python. When a student enters a query, it is preprocessed using TF-IDF Vectorization with word and character n-grams to handle typos. A 2-layer Multi-Layer Perceptron (MLP) Neural Network predicts the user's intent with 99.51% accuracy in less than 15 milliseconds. If an unknown question is asked, a 40% confidence threshold triggers a safe fallback message with college helpdesk contacts. Every interaction is logged in an SQLite database, and the project is publicly hosted on my GitHub repository. Thank you."</w:t>
-      </w:r>
-    </w:p>
-    <w:p>
-      <w:pPr>
-        <w:spacing w:after="80" w:line="288" w:lineRule="auto"/>
-      </w:pPr>
-      <w:r>
-        <w:rPr>
-          <w:rFonts w:ascii="Segoe UI" w:hAnsi="Segoe UI"/>
-          <w:color w:val="1A202C"/>
-          <w:sz w:val="19"/>
-        </w:rPr>
-        <w:t>Q1: Why TF-IDF + Neural MLP instead of keyword search?</w:t>
-        <w:br/>
-        <w:t>Answer: Keyword search fails if a student makes spelling mistakes or uses synonyms. TF-IDF extracts key n-gram weights and Neural MLP learns general semantic patterns across 412 queries with 99.51% accuracy.</w:t>
-      </w:r>
-    </w:p>
-    <w:p>
-      <w:pPr>
-        <w:spacing w:after="80" w:line="288" w:lineRule="auto"/>
-      </w:pPr>
-      <w:r>
-        <w:rPr>
-          <w:rFonts w:ascii="Segoe UI" w:hAnsi="Segoe UI"/>
-          <w:color w:val="1A202C"/>
-          <w:sz w:val="19"/>
-        </w:rPr>
-        <w:t>Q2: What happens if an out-of-syllabus query is asked?</w:t>
-        <w:br/>
-        <w:t>Answer: Our model calculates softmax probability. If confidence is below 40%, it triggers a safe fallback message with department contacts to avoid giving wrong information.</w:t>
-      </w:r>
-    </w:p>
-    <w:p>
-      <w:pPr>
-        <w:spacing w:after="80" w:line="288" w:lineRule="auto"/>
-      </w:pPr>
-      <w:r>
-        <w:rPr>
-          <w:rFonts w:ascii="Segoe UI" w:hAnsi="Segoe UI"/>
-          <w:color w:val="1A202C"/>
-          <w:sz w:val="19"/>
-        </w:rPr>
-        <w:t>Q3: Why Scikit-Learn MLPClassifier?</w:t>
-        <w:br/>
-        <w:t>Answer: In Python 3.12, Scikit-Learn is lighter, faster (11ms latency), and uses only 42MB RAM with zero C-extension conflicts.</w:t>
-      </w:r>
-    </w:p>
-    <w:p>
-      <w:pPr>
-        <w:spacing w:after="80" w:line="288" w:lineRule="auto"/>
-      </w:pPr>
-      <w:r>
-        <w:rPr>
-          <w:rFonts w:ascii="Segoe UI" w:hAnsi="Segoe UI"/>
-          <w:color w:val="1A202C"/>
-          <w:sz w:val="19"/>
-        </w:rPr>
-        <w:t>Q4: Is student data secure?</w:t>
-        <w:br/>
-        <w:t>Answer: Yes. No sensitive student PII or passwords are ever captured. Only sanitized queries, response tags, and latency timestamps are stored in SQLite for performance analytics under the DPDP Act 2023.</w:t>
-      </w:r>
-    </w:p>
-    <w:p>
-      <w:pPr>
-        <w:spacing w:before="240"/>
+        <w:spacing w:before="320"/>
         <w:jc w:val="center"/>
       </w:pPr>
       <w:r>

</xml_diff>